<commit_message>
Going with 2 axis bar scatter chart
</commit_message>
<xml_diff>
--- a/PIMMS Validation work/Methods/PIMMS Experimental Design.docx
+++ b/PIMMS Validation work/Methods/PIMMS Experimental Design.docx
@@ -48,15 +48,7 @@
     </w:p>
     <w:p>
       <w:r>
-        <w:t xml:space="preserve">Create an excel document of the detection frequency for each sample post blank subtraction (mean + 3 </w:t>
-      </w:r>
-      <w:proofErr w:type="spellStart"/>
-      <w:r>
-        <w:t>s.d.</w:t>
-      </w:r>
-      <w:proofErr w:type="spellEnd"/>
-      <w:r>
-        <w:t>)</w:t>
+        <w:t>Create an excel document of the detection frequency for each sample post blank subtraction (mean + 3 s.d.)</w:t>
       </w:r>
     </w:p>
     <w:p>
@@ -114,8 +106,11 @@
     </w:p>
     <w:p>
       <w:r>
+        <w:rPr>
+          <w:noProof/>
+        </w:rPr>
         <w:drawing>
-          <wp:anchor distT="0" distB="0" distL="114300" distR="114300" simplePos="0" relativeHeight="251658240" behindDoc="0" locked="0" layoutInCell="1" allowOverlap="1" wp14:anchorId="17D76F32" wp14:editId="2458E97B">
+          <wp:anchor distT="0" distB="0" distL="114300" distR="114300" simplePos="0" relativeHeight="251658240" behindDoc="0" locked="0" layoutInCell="1" allowOverlap="1" wp14:anchorId="17D76F32" wp14:editId="7AEA72E4">
             <wp:simplePos x="0" y="0"/>
             <wp:positionH relativeFrom="column">
               <wp:posOffset>1762125</wp:posOffset>
@@ -175,13 +170,135 @@
       </w:r>
     </w:p>
     <w:p>
-      <w:pPr>
-        <w:rPr>
-          <w:b/>
-          <w:bCs/>
-          <w:u w:val="single"/>
-        </w:rPr>
-      </w:pPr>
+      <w:r>
+        <w:lastRenderedPageBreak/>
+        <w:t xml:space="preserve">No halogens isotopic model: </w:t>
+      </w:r>
+      <w:r>
+        <w:drawing>
+          <wp:inline distT="0" distB="0" distL="0" distR="0" wp14:anchorId="6009E0A6" wp14:editId="7E4F00B6">
+            <wp:extent cx="2587742" cy="3714750"/>
+            <wp:effectExtent l="0" t="0" r="3175" b="0"/>
+            <wp:docPr id="49026637" name="Picture 1" descr="A screenshot of a computer&#10;&#10;AI-generated content may be incorrect."/>
+            <wp:cNvGraphicFramePr>
+              <a:graphicFrameLocks xmlns:a="http://schemas.openxmlformats.org/drawingml/2006/main" noChangeAspect="1"/>
+            </wp:cNvGraphicFramePr>
+            <a:graphic xmlns:a="http://schemas.openxmlformats.org/drawingml/2006/main">
+              <a:graphicData uri="http://schemas.openxmlformats.org/drawingml/2006/picture">
+                <pic:pic xmlns:pic="http://schemas.openxmlformats.org/drawingml/2006/picture">
+                  <pic:nvPicPr>
+                    <pic:cNvPr id="49026637" name="Picture 1" descr="A screenshot of a computer&#10;&#10;AI-generated content may be incorrect."/>
+                    <pic:cNvPicPr/>
+                  </pic:nvPicPr>
+                  <pic:blipFill>
+                    <a:blip r:embed="rId6"/>
+                    <a:stretch>
+                      <a:fillRect/>
+                    </a:stretch>
+                  </pic:blipFill>
+                  <pic:spPr>
+                    <a:xfrm>
+                      <a:off x="0" y="0"/>
+                      <a:ext cx="2590491" cy="3718696"/>
+                    </a:xfrm>
+                    <a:prstGeom prst="rect">
+                      <a:avLst/>
+                    </a:prstGeom>
+                  </pic:spPr>
+                </pic:pic>
+              </a:graphicData>
+            </a:graphic>
+          </wp:inline>
+        </w:drawing>
+      </w:r>
+    </w:p>
+    <w:p>
+      <w:r>
+        <w:lastRenderedPageBreak/>
+        <w:t xml:space="preserve">“Unbiased”: </w:t>
+      </w:r>
+      <w:r>
+        <w:drawing>
+          <wp:inline distT="0" distB="0" distL="0" distR="0" wp14:anchorId="75FE4008" wp14:editId="4F4DE8D7">
+            <wp:extent cx="4505954" cy="6430272"/>
+            <wp:effectExtent l="0" t="0" r="9525" b="0"/>
+            <wp:docPr id="1833769526" name="Picture 1" descr="A screenshot of a computer&#10;&#10;AI-generated content may be incorrect."/>
+            <wp:cNvGraphicFramePr>
+              <a:graphicFrameLocks xmlns:a="http://schemas.openxmlformats.org/drawingml/2006/main" noChangeAspect="1"/>
+            </wp:cNvGraphicFramePr>
+            <a:graphic xmlns:a="http://schemas.openxmlformats.org/drawingml/2006/main">
+              <a:graphicData uri="http://schemas.openxmlformats.org/drawingml/2006/picture">
+                <pic:pic xmlns:pic="http://schemas.openxmlformats.org/drawingml/2006/picture">
+                  <pic:nvPicPr>
+                    <pic:cNvPr id="1833769526" name="Picture 1" descr="A screenshot of a computer&#10;&#10;AI-generated content may be incorrect."/>
+                    <pic:cNvPicPr/>
+                  </pic:nvPicPr>
+                  <pic:blipFill>
+                    <a:blip r:embed="rId7"/>
+                    <a:stretch>
+                      <a:fillRect/>
+                    </a:stretch>
+                  </pic:blipFill>
+                  <pic:spPr>
+                    <a:xfrm>
+                      <a:off x="0" y="0"/>
+                      <a:ext cx="4505954" cy="6430272"/>
+                    </a:xfrm>
+                    <a:prstGeom prst="rect">
+                      <a:avLst/>
+                    </a:prstGeom>
+                  </pic:spPr>
+                </pic:pic>
+              </a:graphicData>
+            </a:graphic>
+          </wp:inline>
+        </w:drawing>
+      </w:r>
+    </w:p>
+    <w:p>
+      <w:r>
+        <w:t>Unchecked single-ion features with charge state z=1</w:t>
+      </w:r>
+    </w:p>
+    <w:p>
+      <w:r>
+        <w:lastRenderedPageBreak/>
+        <w:drawing>
+          <wp:inline distT="0" distB="0" distL="0" distR="0" wp14:anchorId="2514BCB2" wp14:editId="030C77BA">
+            <wp:extent cx="4515480" cy="6430272"/>
+            <wp:effectExtent l="0" t="0" r="0" b="8890"/>
+            <wp:docPr id="297864437" name="Picture 1" descr="A screenshot of a computer&#10;&#10;AI-generated content may be incorrect."/>
+            <wp:cNvGraphicFramePr>
+              <a:graphicFrameLocks xmlns:a="http://schemas.openxmlformats.org/drawingml/2006/main" noChangeAspect="1"/>
+            </wp:cNvGraphicFramePr>
+            <a:graphic xmlns:a="http://schemas.openxmlformats.org/drawingml/2006/main">
+              <a:graphicData uri="http://schemas.openxmlformats.org/drawingml/2006/picture">
+                <pic:pic xmlns:pic="http://schemas.openxmlformats.org/drawingml/2006/picture">
+                  <pic:nvPicPr>
+                    <pic:cNvPr id="297864437" name="Picture 1" descr="A screenshot of a computer&#10;&#10;AI-generated content may be incorrect."/>
+                    <pic:cNvPicPr/>
+                  </pic:nvPicPr>
+                  <pic:blipFill>
+                    <a:blip r:embed="rId8"/>
+                    <a:stretch>
+                      <a:fillRect/>
+                    </a:stretch>
+                  </pic:blipFill>
+                  <pic:spPr>
+                    <a:xfrm>
+                      <a:off x="0" y="0"/>
+                      <a:ext cx="4515480" cy="6430272"/>
+                    </a:xfrm>
+                    <a:prstGeom prst="rect">
+                      <a:avLst/>
+                    </a:prstGeom>
+                  </pic:spPr>
+                </pic:pic>
+              </a:graphicData>
+            </a:graphic>
+          </wp:inline>
+        </w:drawing>
+      </w:r>
     </w:p>
     <w:p>
       <w:pPr>

</xml_diff>